<commit_message>
docs(trazabilidad): reconcile RF-013/RF-014 across sprint and traceability docs
RF-013 (interoperabilidad institucional) y RF-014 (wearables como validación
clínica) se habían agregado al SRS/SAD pero no estaban reflejados en la
Matriz de Trazabilidad, el plan de Sprint 13 ni el Informe de
Trazabilidad SRS-SAD-Implementación. Se agregan sus bloques/secciones en
los tres artefactos, incluyendo la evidencia de código real y la nota
honesta de que ninguno de los dos cuenta con diagrama UML dedicado.

Co-Authored-By: Claude Sonnet 5 <noreply@anthropic.com>
</commit_message>
<xml_diff>
--- a/Documentation/informes/Plan_Iteracion_Sprint13_RespiCare.docx
+++ b/Documentation/informes/Plan_Iteracion_Sprint13_RespiCare.docx
@@ -834,6 +834,18 @@
       </w:r>
     </w:p>
     <w:p>
+      <w:pPr/>
+      <w:r>
+        <w:rPr>
+          <w:b/>
+        </w:rPr>
+        <w:t xml:space="preserve">Nota de trazabilidad (formalización posterior de RF-013/RF-014): </w:t>
+      </w:r>
+      <w:r>
+        <w:t>los dos entregables de este sprint se documentaron inicialmente en el SRS/SAD como extensiones de requerimientos preexistentes (RF-002/005/007/008/009). Al cerrar la documentación del sprint se formalizaron como dos requerimientos funcionales propios y dedicados, RF-013 (interoperabilidad institucional) y RF-014 (wearables como validación clínica), con sus propios casos de uso (CU-015/CU-016 en el SRS, CU-006/CU-007 en el SAD) y sus propias filas en Matriz_Trazabilidad_RespiCare.xlsx. Ambas framings coexisten intencionalmente: RF-013/RF-014 identifican el requerimiento como unidad propia del catálogo, mientras que las extensiones citadas arriba documentan el mecanismo técnico compartido con los módulos preexistentes sobre los que se construyeron.</w:t>
+      </w:r>
+    </w:p>
+    <w:p>
       <w:pPr>
         <w:jc w:val="both"/>
       </w:pPr>
@@ -939,6 +951,34 @@
       </w:pPr>
       <w:r>
         <w:rPr>
+          <w:b/>
+        </w:rPr>
+        <w:t xml:space="preserve">RF-013: </w:t>
+      </w:r>
+      <w:r>
+        <w:t>Interoperabilidad institucional (MINSA/DIRESA/SINADEF) — requerimiento nuevo dedicado a este sprint (FD03 §Tabla de RF; CU-015 en FD03, CU-006 en FD04), formalizado a partir del entregable “API de interoperabilidad MINSA/SINADEF” de esta misma tabla</w:t>
+      </w:r>
+    </w:p>
+    <w:p>
+      <w:pPr>
+        <w:pStyle w:val="ListBullet"/>
+      </w:pPr>
+      <w:r>
+        <w:rPr>
+          <w:b/>
+        </w:rPr>
+        <w:t xml:space="preserve">RF-014: </w:t>
+      </w:r>
+      <w:r>
+        <w:t>Wearables como capa de validación clínica — requerimiento nuevo dedicado a este sprint (FD03 §Tabla de RF; CU-016 en FD03, CU-007 en FD04), formalizado a partir del entregable de validación de vitales de esta misma tabla</w:t>
+      </w:r>
+    </w:p>
+    <w:p>
+      <w:pPr>
+        <w:pStyle w:val="ListBullet"/>
+      </w:pPr>
+      <w:r>
+        <w:rPr>
           <w:rFonts w:ascii="Times New Roman" w:hAnsi="Times New Roman" w:cs="Times New Roman"/>
           <w:b/>
           <w:i w:val="0"/>
@@ -953,7 +993,7 @@
           <w:i w:val="0"/>
           <w:sz w:val="24"/>
         </w:rPr>
-        <w:t>: Validación de coherencia médica — extensión — validación con vitales de wearables</w:t>
+        <w:t>: Validación de coherencia médica — extensión — validación con vitales de wearables (mecanismo compartido con RF-014)</w:t>
       </w:r>
     </w:p>
     <w:p>
@@ -1022,7 +1062,7 @@
           <w:i w:val="0"/>
           <w:sz w:val="24"/>
         </w:rPr>
-        <w:t>: Historial clínico electrónico — extensión — interoperabilidad institucional MINSA/SINADEF</w:t>
+        <w:t>: Historial clínico electrónico — extensión — interoperabilidad institucional MINSA/SINADEF (mecanismo compartido con RF-013)</w:t>
       </w:r>
     </w:p>
     <w:p>
@@ -1835,7 +1875,7 @@
                 <w:i w:val="0"/>
                 <w:sz w:val="24"/>
               </w:rPr>
-              <w:t xml:space="preserve"> (RF-002/RF-005/RF-007/RF-008/RF-009 ampliados con el alcance de Sprint 13)</w:t>
+              <w:t xml:space="preserve"> (RF-002/RF-005/RF-007/RF-008/RF-009 ampliados con el alcance de Sprint 13; RF-013 y RF-014 agregados como bloques propios de 6 filas cada uno)</w:t>
             </w:r>
           </w:p>
         </w:tc>

</xml_diff>